<commit_message>
feat: expandir tabela comparativa com desmame, separação e socialização (Anexo I do Regulamento)
</commit_message>
<xml_diff>
--- a/tabela_reproducao_comparativa.docx
+++ b/tabela_reproducao_comparativa.docx
@@ -3527,7 +3527,7 @@
           <w:b/>
           <w:sz w:val="20"/>
         </w:rPr>
-        <w:t>10. Separação das crias</w:t>
+        <w:t>10. Separação das crias da progenitora</w:t>
       </w:r>
     </w:p>
     <w:tbl>
@@ -3669,7 +3669,7 @@
                 <w:b/>
                 <w:sz w:val="16"/>
               </w:rPr>
-              <w:t>Idade mínima de separação da progenitora</w:t>
+              <w:t>Cachorros (cães) — idade mínima de separação</w:t>
             </w:r>
           </w:p>
         </w:tc>
@@ -3692,7 +3692,11 @@
               <w:rPr>
                 <w:sz w:val="16"/>
               </w:rPr>
-              <w:t>Não regulado no Art.º 8.º (ver Art.º 7.º e Anexo I sobre alojamento e cuidados)</w:t>
+              <w:t>8 semanas (estabelecimentos de criação, abrigos e famílias de acolhimento)</w:t>
+              <w:br/>
+              <w:t>Derrogação por razões médicas com parecer escrito do MV</w:t>
+              <w:br/>
+              <w:t>(Anexo I, Pt. 4, n.º 3.3)</w:t>
             </w:r>
           </w:p>
         </w:tc>
@@ -3715,7 +3719,7 @@
               <w:rPr>
                 <w:sz w:val="16"/>
               </w:rPr>
-              <w:t>Não regulado no Art.º 8.º</w:t>
+              <w:t>Não regulado no Art.º 8.º nem no Anexo I reprodutivo</w:t>
             </w:r>
           </w:p>
         </w:tc>
@@ -3738,13 +3742,1069 @@
               <w:rPr>
                 <w:sz w:val="16"/>
               </w:rPr>
-              <w:t>Cães: 10.ª semana</w:t>
+              <w:t>10.ª semana de idade</w:t>
               <w:br/>
-              <w:t>Gatos: 12.ª semana</w:t>
-              <w:br/>
-              <w:t>(com desmame gradual)</w:t>
+              <w:t>(com período de desmame gradual)</w:t>
               <w:br/>
               <w:t>(Art.º 70.º, n.º 5)</w:t>
+            </w:r>
+          </w:p>
+        </w:tc>
+      </w:tr>
+      <w:tr>
+        <w:tc>
+          <w:tcPr>
+            <w:tcW w:type="dxa" w:w="2268"/>
+            <w:vAlign w:val="top"/>
+            <w:tcMar>
+              <w:top w:w="50" w:type="dxa"/>
+              <w:start w:w="100" w:type="dxa"/>
+              <w:bottom w:w="50" w:type="dxa"/>
+              <w:end w:w="100" w:type="dxa"/>
+            </w:tcMar>
+          </w:tcPr>
+          <w:p>
+            <w:pPr>
+              <w:jc w:val="left"/>
+            </w:pPr>
+            <w:r>
+              <w:rPr>
+                <w:b/>
+                <w:sz w:val="16"/>
+              </w:rPr>
+              <w:t>Gatinhos — idade mínima de separação</w:t>
+            </w:r>
+          </w:p>
+        </w:tc>
+        <w:tc>
+          <w:tcPr>
+            <w:tcW w:type="dxa" w:w="2835"/>
+            <w:vAlign w:val="top"/>
+            <w:tcMar>
+              <w:top w:w="50" w:type="dxa"/>
+              <w:start w:w="100" w:type="dxa"/>
+              <w:bottom w:w="50" w:type="dxa"/>
+              <w:end w:w="100" w:type="dxa"/>
+            </w:tcMar>
+          </w:tcPr>
+          <w:p>
+            <w:pPr>
+              <w:jc w:val="left"/>
+            </w:pPr>
+            <w:r>
+              <w:rPr>
+                <w:sz w:val="16"/>
+              </w:rPr>
+              <w:t>Abrigos e famílias de acolhimento: 8 semanas</w:t>
+              <w:br/>
+              <w:t>Estabelecimentos de criação: 12 semanas</w:t>
+              <w:br/>
+              <w:t>Derrogação por razões médicas com parecer escrito do MV</w:t>
+              <w:br/>
+              <w:t>(Anexo I, Pt. 4, n.º 3.3)</w:t>
+            </w:r>
+          </w:p>
+        </w:tc>
+        <w:tc>
+          <w:tcPr>
+            <w:tcW w:type="dxa" w:w="3118"/>
+            <w:vAlign w:val="top"/>
+            <w:tcMar>
+              <w:top w:w="50" w:type="dxa"/>
+              <w:start w:w="100" w:type="dxa"/>
+              <w:bottom w:w="50" w:type="dxa"/>
+              <w:end w:w="100" w:type="dxa"/>
+            </w:tcMar>
+          </w:tcPr>
+          <w:p>
+            <w:pPr>
+              <w:jc w:val="left"/>
+            </w:pPr>
+            <w:r>
+              <w:rPr>
+                <w:sz w:val="16"/>
+              </w:rPr>
+              <w:t>Não regulado no Art.º 8.º nem no Anexo I reprodutivo</w:t>
+            </w:r>
+          </w:p>
+        </w:tc>
+        <w:tc>
+          <w:tcPr>
+            <w:tcW w:type="dxa" w:w="3118"/>
+            <w:vAlign w:val="top"/>
+            <w:tcMar>
+              <w:top w:w="50" w:type="dxa"/>
+              <w:start w:w="100" w:type="dxa"/>
+              <w:bottom w:w="50" w:type="dxa"/>
+              <w:end w:w="100" w:type="dxa"/>
+            </w:tcMar>
+          </w:tcPr>
+          <w:p>
+            <w:pPr>
+              <w:jc w:val="left"/>
+            </w:pPr>
+            <w:r>
+              <w:rPr>
+                <w:sz w:val="16"/>
+              </w:rPr>
+              <w:t>12.ª semana de idade</w:t>
+              <w:br/>
+              <w:t>(com período de desmame gradual)</w:t>
+              <w:br/>
+              <w:t>(Art.º 70.º, n.º 5)</w:t>
+            </w:r>
+          </w:p>
+        </w:tc>
+      </w:tr>
+      <w:tr>
+        <w:tc>
+          <w:tcPr>
+            <w:tcW w:type="dxa" w:w="2268"/>
+            <w:vAlign w:val="top"/>
+            <w:tcMar>
+              <w:top w:w="50" w:type="dxa"/>
+              <w:start w:w="100" w:type="dxa"/>
+              <w:bottom w:w="50" w:type="dxa"/>
+              <w:end w:w="100" w:type="dxa"/>
+            </w:tcMar>
+          </w:tcPr>
+          <w:p>
+            <w:pPr>
+              <w:jc w:val="left"/>
+            </w:pPr>
+            <w:r>
+              <w:rPr>
+                <w:b/>
+                <w:sz w:val="16"/>
+              </w:rPr>
+              <w:t>Registo do parecer de derrogação</w:t>
+            </w:r>
+          </w:p>
+        </w:tc>
+        <w:tc>
+          <w:tcPr>
+            <w:tcW w:type="dxa" w:w="2835"/>
+            <w:vAlign w:val="top"/>
+            <w:tcMar>
+              <w:top w:w="50" w:type="dxa"/>
+              <w:start w:w="100" w:type="dxa"/>
+              <w:bottom w:w="50" w:type="dxa"/>
+              <w:end w:w="100" w:type="dxa"/>
+            </w:tcMar>
+          </w:tcPr>
+          <w:p>
+            <w:pPr>
+              <w:jc w:val="left"/>
+            </w:pPr>
+            <w:r>
+              <w:rPr>
+                <w:sz w:val="16"/>
+              </w:rPr>
+              <w:t>O operador conserva o registo até ao último cachorro/gatinho da ninhada ser colocado no mercado</w:t>
+              <w:br/>
+              <w:t>(Anexo I, Pt. 4, n.º 3.3)</w:t>
+            </w:r>
+          </w:p>
+        </w:tc>
+        <w:tc>
+          <w:tcPr>
+            <w:tcW w:type="dxa" w:w="3118"/>
+            <w:vAlign w:val="top"/>
+            <w:tcMar>
+              <w:top w:w="50" w:type="dxa"/>
+              <w:start w:w="100" w:type="dxa"/>
+              <w:bottom w:w="50" w:type="dxa"/>
+              <w:end w:w="100" w:type="dxa"/>
+            </w:tcMar>
+          </w:tcPr>
+          <w:p>
+            <w:pPr>
+              <w:jc w:val="left"/>
+            </w:pPr>
+            <w:r>
+              <w:rPr>
+                <w:sz w:val="16"/>
+              </w:rPr>
+              <w:t>Não regulado</w:t>
+            </w:r>
+          </w:p>
+        </w:tc>
+        <w:tc>
+          <w:tcPr>
+            <w:tcW w:type="dxa" w:w="3118"/>
+            <w:vAlign w:val="top"/>
+            <w:tcMar>
+              <w:top w:w="50" w:type="dxa"/>
+              <w:start w:w="100" w:type="dxa"/>
+              <w:bottom w:w="50" w:type="dxa"/>
+              <w:end w:w="100" w:type="dxa"/>
+            </w:tcMar>
+          </w:tcPr>
+          <w:p>
+            <w:pPr>
+              <w:jc w:val="left"/>
+            </w:pPr>
+            <w:r>
+              <w:rPr>
+                <w:sz w:val="16"/>
+              </w:rPr>
+              <w:t>Não regulado explicitamente</w:t>
+            </w:r>
+          </w:p>
+        </w:tc>
+      </w:tr>
+    </w:tbl>
+    <w:p/>
+    <w:p>
+      <w:pPr>
+        <w:spacing w:before="120" w:after="40"/>
+      </w:pPr>
+      <w:r>
+        <w:rPr>
+          <w:b/>
+          <w:sz w:val="20"/>
+        </w:rPr>
+        <w:t>11. Desmame (processo e critérios)</w:t>
+      </w:r>
+    </w:p>
+    <w:tbl>
+      <w:tblPr>
+        <w:tblStyle w:val="TableGrid"/>
+        <w:tblW w:type="auto" w:w="0"/>
+        <w:jc w:val="left"/>
+        <w:tblLook w:firstColumn="1" w:firstRow="1" w:lastColumn="0" w:lastRow="0" w:noHBand="0" w:noVBand="1" w:val="04A0"/>
+      </w:tblPr>
+      <w:tblGrid>
+        <w:gridCol w:w="2268"/>
+        <w:gridCol w:w="2835"/>
+        <w:gridCol w:w="3118"/>
+        <w:gridCol w:w="3118"/>
+      </w:tblGrid>
+      <w:tr>
+        <w:trPr>
+          <w:tblHeader/>
+        </w:trPr>
+        <w:tc>
+          <w:tcPr>
+            <w:tcW w:type="dxa" w:w="2268"/>
+            <w:vAlign w:val="center"/>
+            <w:tcMar>
+              <w:top w:w="50" w:type="dxa"/>
+              <w:start w:w="100" w:type="dxa"/>
+              <w:bottom w:w="50" w:type="dxa"/>
+              <w:end w:w="100" w:type="dxa"/>
+            </w:tcMar>
+          </w:tcPr>
+          <w:p>
+            <w:pPr>
+              <w:jc w:val="center"/>
+            </w:pPr>
+            <w:r>
+              <w:rPr>
+                <w:b/>
+                <w:sz w:val="17"/>
+              </w:rPr>
+              <w:t>Critério</w:t>
+            </w:r>
+          </w:p>
+        </w:tc>
+        <w:tc>
+          <w:tcPr>
+            <w:tcW w:type="dxa" w:w="2835"/>
+            <w:vAlign w:val="center"/>
+            <w:tcMar>
+              <w:top w:w="50" w:type="dxa"/>
+              <w:start w:w="100" w:type="dxa"/>
+              <w:bottom w:w="50" w:type="dxa"/>
+              <w:end w:w="100" w:type="dxa"/>
+            </w:tcMar>
+          </w:tcPr>
+          <w:p>
+            <w:pPr>
+              <w:jc w:val="center"/>
+            </w:pPr>
+            <w:r>
+              <w:rPr>
+                <w:b/>
+                <w:sz w:val="17"/>
+              </w:rPr>
+              <w:t>Regulamento (UE) 2023/0447</w:t>
+            </w:r>
+          </w:p>
+        </w:tc>
+        <w:tc>
+          <w:tcPr>
+            <w:tcW w:type="dxa" w:w="3118"/>
+            <w:vAlign w:val="center"/>
+            <w:tcMar>
+              <w:top w:w="50" w:type="dxa"/>
+              <w:start w:w="100" w:type="dxa"/>
+              <w:bottom w:w="50" w:type="dxa"/>
+              <w:end w:w="100" w:type="dxa"/>
+            </w:tcMar>
+          </w:tcPr>
+          <w:p>
+            <w:pPr>
+              <w:jc w:val="center"/>
+            </w:pPr>
+            <w:r>
+              <w:rPr>
+                <w:b/>
+                <w:sz w:val="17"/>
+              </w:rPr>
+              <w:t>@codigo</w:t>
+              <w:br/>
+              <w:t>(proposta DL 214/2013)</w:t>
+            </w:r>
+          </w:p>
+        </w:tc>
+        <w:tc>
+          <w:tcPr>
+            <w:tcW w:type="dxa" w:w="3118"/>
+            <w:vAlign w:val="center"/>
+            <w:tcMar>
+              <w:top w:w="50" w:type="dxa"/>
+              <w:start w:w="100" w:type="dxa"/>
+              <w:bottom w:w="50" w:type="dxa"/>
+              <w:end w:w="100" w:type="dxa"/>
+            </w:tcMar>
+          </w:tcPr>
+          <w:p>
+            <w:pPr>
+              <w:jc w:val="center"/>
+            </w:pPr>
+            <w:r>
+              <w:rPr>
+                <w:b/>
+                <w:sz w:val="17"/>
+              </w:rPr>
+              <w:t>@rgbeac</w:t>
+              <w:br/>
+              <w:t>(proposta jun. 2025)</w:t>
+            </w:r>
+          </w:p>
+        </w:tc>
+      </w:tr>
+      <w:tr>
+        <w:tc>
+          <w:tcPr>
+            <w:tcW w:type="dxa" w:w="2268"/>
+            <w:vAlign w:val="top"/>
+            <w:tcMar>
+              <w:top w:w="50" w:type="dxa"/>
+              <w:start w:w="100" w:type="dxa"/>
+              <w:bottom w:w="50" w:type="dxa"/>
+              <w:end w:w="100" w:type="dxa"/>
+            </w:tcMar>
+          </w:tcPr>
+          <w:p>
+            <w:pPr>
+              <w:jc w:val="left"/>
+            </w:pPr>
+            <w:r>
+              <w:rPr>
+                <w:b/>
+                <w:sz w:val="16"/>
+              </w:rPr>
+              <w:t>Processo de desmame — duração e método</w:t>
+            </w:r>
+          </w:p>
+        </w:tc>
+        <w:tc>
+          <w:tcPr>
+            <w:tcW w:type="dxa" w:w="2835"/>
+            <w:vAlign w:val="top"/>
+            <w:tcMar>
+              <w:top w:w="50" w:type="dxa"/>
+              <w:start w:w="100" w:type="dxa"/>
+              <w:bottom w:w="50" w:type="dxa"/>
+              <w:end w:w="100" w:type="dxa"/>
+            </w:tcMar>
+          </w:tcPr>
+          <w:p>
+            <w:pPr>
+              <w:jc w:val="left"/>
+            </w:pPr>
+            <w:r>
+              <w:rPr>
+                <w:sz w:val="16"/>
+              </w:rPr>
+              <w:t>Introdução gradual de alimentos sólidos ao longo de um período não inferior a 7 dias</w:t>
+              <w:br/>
+              <w:t>(Anexo I, Pt. 1, n.º 4.4)</w:t>
+            </w:r>
+          </w:p>
+        </w:tc>
+        <w:tc>
+          <w:tcPr>
+            <w:tcW w:type="dxa" w:w="3118"/>
+            <w:vAlign w:val="top"/>
+            <w:tcMar>
+              <w:top w:w="50" w:type="dxa"/>
+              <w:start w:w="100" w:type="dxa"/>
+              <w:bottom w:w="50" w:type="dxa"/>
+              <w:end w:w="100" w:type="dxa"/>
+            </w:tcMar>
+          </w:tcPr>
+          <w:p>
+            <w:pPr>
+              <w:jc w:val="left"/>
+            </w:pPr>
+            <w:r>
+              <w:rPr>
+                <w:sz w:val="16"/>
+              </w:rPr>
+              <w:t>Não regulado especificamente</w:t>
+              <w:br/>
+              <w:t>(o @codigo prevê programa de alimentação adequado à fase fisiológica — Art.º 8.º, n.º 2, al. a) por referência ao Anexo I)</w:t>
+            </w:r>
+          </w:p>
+        </w:tc>
+        <w:tc>
+          <w:tcPr>
+            <w:tcW w:type="dxa" w:w="3118"/>
+            <w:vAlign w:val="top"/>
+            <w:tcMar>
+              <w:top w:w="50" w:type="dxa"/>
+              <w:start w:w="100" w:type="dxa"/>
+              <w:bottom w:w="50" w:type="dxa"/>
+              <w:end w:w="100" w:type="dxa"/>
+            </w:tcMar>
+          </w:tcPr>
+          <w:p>
+            <w:pPr>
+              <w:jc w:val="left"/>
+            </w:pPr>
+            <w:r>
+              <w:rPr>
+                <w:sz w:val="16"/>
+              </w:rPr>
+              <w:t>«Período de desmame gradual» salvaguardado antes da separação</w:t>
+              <w:br/>
+              <w:t>(Art.º 70.º, n.º 5 — não especifica duração)</w:t>
+            </w:r>
+          </w:p>
+        </w:tc>
+      </w:tr>
+      <w:tr>
+        <w:tc>
+          <w:tcPr>
+            <w:tcW w:type="dxa" w:w="2268"/>
+            <w:vAlign w:val="top"/>
+            <w:tcMar>
+              <w:top w:w="50" w:type="dxa"/>
+              <w:start w:w="100" w:type="dxa"/>
+              <w:bottom w:w="50" w:type="dxa"/>
+              <w:end w:w="100" w:type="dxa"/>
+            </w:tcMar>
+          </w:tcPr>
+          <w:p>
+            <w:pPr>
+              <w:jc w:val="left"/>
+            </w:pPr>
+            <w:r>
+              <w:rPr>
+                <w:b/>
+                <w:sz w:val="16"/>
+              </w:rPr>
+              <w:t>Idade mínima para conclusão do desmame</w:t>
+            </w:r>
+          </w:p>
+        </w:tc>
+        <w:tc>
+          <w:tcPr>
+            <w:tcW w:type="dxa" w:w="2835"/>
+            <w:vAlign w:val="top"/>
+            <w:tcMar>
+              <w:top w:w="50" w:type="dxa"/>
+              <w:start w:w="100" w:type="dxa"/>
+              <w:bottom w:w="50" w:type="dxa"/>
+              <w:end w:w="100" w:type="dxa"/>
+            </w:tcMar>
+          </w:tcPr>
+          <w:p>
+            <w:pPr>
+              <w:jc w:val="left"/>
+            </w:pPr>
+            <w:r>
+              <w:rPr>
+                <w:sz w:val="16"/>
+              </w:rPr>
+              <w:t>Não antes das 6 semanas de idade (tanto para cachorros como para gatinhos)</w:t>
+              <w:br/>
+              <w:t>(Anexo I, Pt. 1, n.º 4.4)</w:t>
+            </w:r>
+          </w:p>
+        </w:tc>
+        <w:tc>
+          <w:tcPr>
+            <w:tcW w:type="dxa" w:w="3118"/>
+            <w:vAlign w:val="top"/>
+            <w:tcMar>
+              <w:top w:w="50" w:type="dxa"/>
+              <w:start w:w="100" w:type="dxa"/>
+              <w:bottom w:w="50" w:type="dxa"/>
+              <w:end w:w="100" w:type="dxa"/>
+            </w:tcMar>
+          </w:tcPr>
+          <w:p>
+            <w:pPr>
+              <w:jc w:val="left"/>
+            </w:pPr>
+            <w:r>
+              <w:rPr>
+                <w:sz w:val="16"/>
+              </w:rPr>
+              <w:t>Não regulado</w:t>
+            </w:r>
+          </w:p>
+        </w:tc>
+        <w:tc>
+          <w:tcPr>
+            <w:tcW w:type="dxa" w:w="3118"/>
+            <w:vAlign w:val="top"/>
+            <w:tcMar>
+              <w:top w:w="50" w:type="dxa"/>
+              <w:start w:w="100" w:type="dxa"/>
+              <w:bottom w:w="50" w:type="dxa"/>
+              <w:end w:w="100" w:type="dxa"/>
+            </w:tcMar>
+          </w:tcPr>
+          <w:p>
+            <w:pPr>
+              <w:jc w:val="left"/>
+            </w:pPr>
+            <w:r>
+              <w:rPr>
+                <w:sz w:val="16"/>
+              </w:rPr>
+              <w:t>Não regulado explicitamente (a separação só é permitida a partir da 10.ª/12.ª semana, o que implica desmame anterior)</w:t>
+            </w:r>
+          </w:p>
+        </w:tc>
+      </w:tr>
+      <w:tr>
+        <w:tc>
+          <w:tcPr>
+            <w:tcW w:type="dxa" w:w="2268"/>
+            <w:vAlign w:val="top"/>
+            <w:tcMar>
+              <w:top w:w="50" w:type="dxa"/>
+              <w:start w:w="100" w:type="dxa"/>
+              <w:bottom w:w="50" w:type="dxa"/>
+              <w:end w:w="100" w:type="dxa"/>
+            </w:tcMar>
+          </w:tcPr>
+          <w:p>
+            <w:pPr>
+              <w:jc w:val="left"/>
+            </w:pPr>
+            <w:r>
+              <w:rPr>
+                <w:b/>
+                <w:sz w:val="16"/>
+              </w:rPr>
+              <w:t>Alimentação de cachorros/gatinhos não desmamados</w:t>
+            </w:r>
+          </w:p>
+        </w:tc>
+        <w:tc>
+          <w:tcPr>
+            <w:tcW w:type="dxa" w:w="2835"/>
+            <w:vAlign w:val="top"/>
+            <w:tcMar>
+              <w:top w:w="50" w:type="dxa"/>
+              <w:start w:w="100" w:type="dxa"/>
+              <w:bottom w:w="50" w:type="dxa"/>
+              <w:end w:w="100" w:type="dxa"/>
+            </w:tcMar>
+          </w:tcPr>
+          <w:p>
+            <w:pPr>
+              <w:jc w:val="left"/>
+            </w:pPr>
+            <w:r>
+              <w:rPr>
+                <w:sz w:val="16"/>
+              </w:rPr>
+              <w:t>Colostro nos primeiros 2 dias; depois leite da progenitora ou de cadela/gata lactante; se impossível, sucedâneo de leite específico para cachorros/gatinhos</w:t>
+              <w:br/>
+              <w:t>(Anexo I, Pt. 1, n.º 2.2)</w:t>
+            </w:r>
+          </w:p>
+        </w:tc>
+        <w:tc>
+          <w:tcPr>
+            <w:tcW w:type="dxa" w:w="3118"/>
+            <w:vAlign w:val="top"/>
+            <w:tcMar>
+              <w:top w:w="50" w:type="dxa"/>
+              <w:start w:w="100" w:type="dxa"/>
+              <w:bottom w:w="50" w:type="dxa"/>
+              <w:end w:w="100" w:type="dxa"/>
+            </w:tcMar>
+          </w:tcPr>
+          <w:p>
+            <w:pPr>
+              <w:jc w:val="left"/>
+            </w:pPr>
+            <w:r>
+              <w:rPr>
+                <w:sz w:val="16"/>
+              </w:rPr>
+              <w:t>Não regulado no Anexo I reprodutivo</w:t>
+              <w:br/>
+              <w:t>(o Art.º 8.º, n.º 3, al. f) do @codigo prevê alojamento de fêmeas com crias em condições de bem-estar)</w:t>
+            </w:r>
+          </w:p>
+        </w:tc>
+        <w:tc>
+          <w:tcPr>
+            <w:tcW w:type="dxa" w:w="3118"/>
+            <w:vAlign w:val="top"/>
+            <w:tcMar>
+              <w:top w:w="50" w:type="dxa"/>
+              <w:start w:w="100" w:type="dxa"/>
+              <w:bottom w:w="50" w:type="dxa"/>
+              <w:end w:w="100" w:type="dxa"/>
+            </w:tcMar>
+          </w:tcPr>
+          <w:p>
+            <w:pPr>
+              <w:jc w:val="left"/>
+            </w:pPr>
+            <w:r>
+              <w:rPr>
+                <w:sz w:val="16"/>
+              </w:rPr>
+              <w:t>Não regulado especificamente no Art.º 70.º</w:t>
+            </w:r>
+          </w:p>
+        </w:tc>
+      </w:tr>
+      <w:tr>
+        <w:tc>
+          <w:tcPr>
+            <w:tcW w:type="dxa" w:w="2268"/>
+            <w:vAlign w:val="top"/>
+            <w:tcMar>
+              <w:top w:w="50" w:type="dxa"/>
+              <w:start w:w="100" w:type="dxa"/>
+              <w:bottom w:w="50" w:type="dxa"/>
+              <w:end w:w="100" w:type="dxa"/>
+            </w:tcMar>
+          </w:tcPr>
+          <w:p>
+            <w:pPr>
+              <w:jc w:val="left"/>
+            </w:pPr>
+            <w:r>
+              <w:rPr>
+                <w:b/>
+                <w:sz w:val="16"/>
+              </w:rPr>
+              <w:t>Monitorização do crescimento de não desmamados</w:t>
+            </w:r>
+          </w:p>
+        </w:tc>
+        <w:tc>
+          <w:tcPr>
+            <w:tcW w:type="dxa" w:w="2835"/>
+            <w:vAlign w:val="top"/>
+            <w:tcMar>
+              <w:top w:w="50" w:type="dxa"/>
+              <w:start w:w="100" w:type="dxa"/>
+              <w:bottom w:w="50" w:type="dxa"/>
+              <w:end w:w="100" w:type="dxa"/>
+            </w:tcMar>
+          </w:tcPr>
+          <w:p>
+            <w:pPr>
+              <w:jc w:val="left"/>
+            </w:pPr>
+            <w:r>
+              <w:rPr>
+                <w:sz w:val="16"/>
+              </w:rPr>
+              <w:t>Todos os cachorros/gatinhos não desmamados devem receber leite, sucedâneo ou combinação em quantidade suficiente para ganho de peso constante</w:t>
+              <w:br/>
+              <w:t>(Anexo I, Pt. 1, n.º 3.3)</w:t>
+            </w:r>
+          </w:p>
+        </w:tc>
+        <w:tc>
+          <w:tcPr>
+            <w:tcW w:type="dxa" w:w="3118"/>
+            <w:vAlign w:val="top"/>
+            <w:tcMar>
+              <w:top w:w="50" w:type="dxa"/>
+              <w:start w:w="100" w:type="dxa"/>
+              <w:bottom w:w="50" w:type="dxa"/>
+              <w:end w:w="100" w:type="dxa"/>
+            </w:tcMar>
+          </w:tcPr>
+          <w:p>
+            <w:pPr>
+              <w:jc w:val="left"/>
+            </w:pPr>
+            <w:r>
+              <w:rPr>
+                <w:sz w:val="16"/>
+              </w:rPr>
+              <w:t>Não regulado</w:t>
+            </w:r>
+          </w:p>
+        </w:tc>
+        <w:tc>
+          <w:tcPr>
+            <w:tcW w:type="dxa" w:w="3118"/>
+            <w:vAlign w:val="top"/>
+            <w:tcMar>
+              <w:top w:w="50" w:type="dxa"/>
+              <w:start w:w="100" w:type="dxa"/>
+              <w:bottom w:w="50" w:type="dxa"/>
+              <w:end w:w="100" w:type="dxa"/>
+            </w:tcMar>
+          </w:tcPr>
+          <w:p>
+            <w:pPr>
+              <w:jc w:val="left"/>
+            </w:pPr>
+            <w:r>
+              <w:rPr>
+                <w:sz w:val="16"/>
+              </w:rPr>
+              <w:t>Não regulado</w:t>
+            </w:r>
+          </w:p>
+        </w:tc>
+      </w:tr>
+    </w:tbl>
+    <w:p/>
+    <w:p>
+      <w:pPr>
+        <w:spacing w:before="120" w:after="40"/>
+      </w:pPr>
+      <w:r>
+        <w:rPr>
+          <w:b/>
+          <w:sz w:val="20"/>
+        </w:rPr>
+        <w:t>12. Socialização das crias</w:t>
+      </w:r>
+    </w:p>
+    <w:tbl>
+      <w:tblPr>
+        <w:tblStyle w:val="TableGrid"/>
+        <w:tblW w:type="auto" w:w="0"/>
+        <w:jc w:val="left"/>
+        <w:tblLook w:firstColumn="1" w:firstRow="1" w:lastColumn="0" w:lastRow="0" w:noHBand="0" w:noVBand="1" w:val="04A0"/>
+      </w:tblPr>
+      <w:tblGrid>
+        <w:gridCol w:w="2268"/>
+        <w:gridCol w:w="2835"/>
+        <w:gridCol w:w="3118"/>
+        <w:gridCol w:w="3118"/>
+      </w:tblGrid>
+      <w:tr>
+        <w:trPr>
+          <w:tblHeader/>
+        </w:trPr>
+        <w:tc>
+          <w:tcPr>
+            <w:tcW w:type="dxa" w:w="2268"/>
+            <w:vAlign w:val="center"/>
+            <w:tcMar>
+              <w:top w:w="50" w:type="dxa"/>
+              <w:start w:w="100" w:type="dxa"/>
+              <w:bottom w:w="50" w:type="dxa"/>
+              <w:end w:w="100" w:type="dxa"/>
+            </w:tcMar>
+          </w:tcPr>
+          <w:p>
+            <w:pPr>
+              <w:jc w:val="center"/>
+            </w:pPr>
+            <w:r>
+              <w:rPr>
+                <w:b/>
+                <w:sz w:val="17"/>
+              </w:rPr>
+              <w:t>Critério</w:t>
+            </w:r>
+          </w:p>
+        </w:tc>
+        <w:tc>
+          <w:tcPr>
+            <w:tcW w:type="dxa" w:w="2835"/>
+            <w:vAlign w:val="center"/>
+            <w:tcMar>
+              <w:top w:w="50" w:type="dxa"/>
+              <w:start w:w="100" w:type="dxa"/>
+              <w:bottom w:w="50" w:type="dxa"/>
+              <w:end w:w="100" w:type="dxa"/>
+            </w:tcMar>
+          </w:tcPr>
+          <w:p>
+            <w:pPr>
+              <w:jc w:val="center"/>
+            </w:pPr>
+            <w:r>
+              <w:rPr>
+                <w:b/>
+                <w:sz w:val="17"/>
+              </w:rPr>
+              <w:t>Regulamento (UE) 2023/0447</w:t>
+            </w:r>
+          </w:p>
+        </w:tc>
+        <w:tc>
+          <w:tcPr>
+            <w:tcW w:type="dxa" w:w="3118"/>
+            <w:vAlign w:val="center"/>
+            <w:tcMar>
+              <w:top w:w="50" w:type="dxa"/>
+              <w:start w:w="100" w:type="dxa"/>
+              <w:bottom w:w="50" w:type="dxa"/>
+              <w:end w:w="100" w:type="dxa"/>
+            </w:tcMar>
+          </w:tcPr>
+          <w:p>
+            <w:pPr>
+              <w:jc w:val="center"/>
+            </w:pPr>
+            <w:r>
+              <w:rPr>
+                <w:b/>
+                <w:sz w:val="17"/>
+              </w:rPr>
+              <w:t>@codigo</w:t>
+              <w:br/>
+              <w:t>(proposta DL 214/2013)</w:t>
+            </w:r>
+          </w:p>
+        </w:tc>
+        <w:tc>
+          <w:tcPr>
+            <w:tcW w:type="dxa" w:w="3118"/>
+            <w:vAlign w:val="center"/>
+            <w:tcMar>
+              <w:top w:w="50" w:type="dxa"/>
+              <w:start w:w="100" w:type="dxa"/>
+              <w:bottom w:w="50" w:type="dxa"/>
+              <w:end w:w="100" w:type="dxa"/>
+            </w:tcMar>
+          </w:tcPr>
+          <w:p>
+            <w:pPr>
+              <w:jc w:val="center"/>
+            </w:pPr>
+            <w:r>
+              <w:rPr>
+                <w:b/>
+                <w:sz w:val="17"/>
+              </w:rPr>
+              <w:t>@rgbeac</w:t>
+              <w:br/>
+              <w:t>(proposta jun. 2025)</w:t>
+            </w:r>
+          </w:p>
+        </w:tc>
+      </w:tr>
+      <w:tr>
+        <w:tc>
+          <w:tcPr>
+            <w:tcW w:type="dxa" w:w="2268"/>
+            <w:vAlign w:val="top"/>
+            <w:tcMar>
+              <w:top w:w="50" w:type="dxa"/>
+              <w:start w:w="100" w:type="dxa"/>
+              <w:bottom w:w="50" w:type="dxa"/>
+              <w:end w:w="100" w:type="dxa"/>
+            </w:tcMar>
+          </w:tcPr>
+          <w:p>
+            <w:pPr>
+              <w:jc w:val="left"/>
+            </w:pPr>
+            <w:r>
+              <w:rPr>
+                <w:b/>
+                <w:sz w:val="16"/>
+              </w:rPr>
+              <w:t>Idade de início e tipo de socialização</w:t>
+            </w:r>
+          </w:p>
+        </w:tc>
+        <w:tc>
+          <w:tcPr>
+            <w:tcW w:type="dxa" w:w="2835"/>
+            <w:vAlign w:val="top"/>
+            <w:tcMar>
+              <w:top w:w="50" w:type="dxa"/>
+              <w:start w:w="100" w:type="dxa"/>
+              <w:bottom w:w="50" w:type="dxa"/>
+              <w:end w:w="100" w:type="dxa"/>
+            </w:tcMar>
+          </w:tcPr>
+          <w:p>
+            <w:pPr>
+              <w:jc w:val="left"/>
+            </w:pPr>
+            <w:r>
+              <w:rPr>
+                <w:sz w:val="16"/>
+              </w:rPr>
+              <w:t>A partir das 3 semanas de idade: oportunidades diárias e progressivas de contacto social com congéneres, seres humanos e, sempre que possível, outras espécies</w:t>
+              <w:br/>
+              <w:t>(Anexo I, Pt. 4, n.º 1.1)</w:t>
+            </w:r>
+          </w:p>
+        </w:tc>
+        <w:tc>
+          <w:tcPr>
+            <w:tcW w:type="dxa" w:w="3118"/>
+            <w:vAlign w:val="top"/>
+            <w:tcMar>
+              <w:top w:w="50" w:type="dxa"/>
+              <w:start w:w="100" w:type="dxa"/>
+              <w:bottom w:w="50" w:type="dxa"/>
+              <w:end w:w="100" w:type="dxa"/>
+            </w:tcMar>
+          </w:tcPr>
+          <w:p>
+            <w:pPr>
+              <w:jc w:val="left"/>
+            </w:pPr>
+            <w:r>
+              <w:rPr>
+                <w:sz w:val="16"/>
+              </w:rPr>
+              <w:t>Não regulado especificamente na secção de reprodução</w:t>
+              <w:br/>
+              <w:t>(o @codigo exige enriquecimento ambiental — Art.º 13.º, n.º 5)</w:t>
+            </w:r>
+          </w:p>
+        </w:tc>
+        <w:tc>
+          <w:tcPr>
+            <w:tcW w:type="dxa" w:w="3118"/>
+            <w:vAlign w:val="top"/>
+            <w:tcMar>
+              <w:top w:w="50" w:type="dxa"/>
+              <w:start w:w="100" w:type="dxa"/>
+              <w:bottom w:w="50" w:type="dxa"/>
+              <w:end w:w="100" w:type="dxa"/>
+            </w:tcMar>
+          </w:tcPr>
+          <w:p>
+            <w:pPr>
+              <w:jc w:val="left"/>
+            </w:pPr>
+            <w:r>
+              <w:rPr>
+                <w:sz w:val="16"/>
+              </w:rPr>
+              <w:t>Todos os alojamentos de criação de cães e gatos devem dispor de um plano de socialização e enriquecimento ambiental</w:t>
+              <w:br/>
+              <w:t>(Art.º 52.º, n.º 7 do @rgbeac)</w:t>
+            </w:r>
+          </w:p>
+        </w:tc>
+      </w:tr>
+      <w:tr>
+        <w:tc>
+          <w:tcPr>
+            <w:tcW w:type="dxa" w:w="2268"/>
+            <w:vAlign w:val="top"/>
+            <w:tcMar>
+              <w:top w:w="50" w:type="dxa"/>
+              <w:start w:w="100" w:type="dxa"/>
+              <w:bottom w:w="50" w:type="dxa"/>
+              <w:end w:w="100" w:type="dxa"/>
+            </w:tcMar>
+          </w:tcPr>
+          <w:p>
+            <w:pPr>
+              <w:jc w:val="left"/>
+            </w:pPr>
+            <w:r>
+              <w:rPr>
+                <w:b/>
+                <w:sz w:val="16"/>
+              </w:rPr>
+              <w:t>Separação por comportamento agressivo</w:t>
+            </w:r>
+          </w:p>
+        </w:tc>
+        <w:tc>
+          <w:tcPr>
+            <w:tcW w:type="dxa" w:w="2835"/>
+            <w:vAlign w:val="top"/>
+            <w:tcMar>
+              <w:top w:w="50" w:type="dxa"/>
+              <w:start w:w="100" w:type="dxa"/>
+              <w:bottom w:w="50" w:type="dxa"/>
+              <w:end w:w="100" w:type="dxa"/>
+            </w:tcMar>
+          </w:tcPr>
+          <w:p>
+            <w:pPr>
+              <w:jc w:val="left"/>
+            </w:pPr>
+            <w:r>
+              <w:rPr>
+                <w:sz w:val="16"/>
+              </w:rPr>
+              <w:t>Animais que representem ameaça ou causem stress excessivo devem ser mantidos separados</w:t>
+              <w:br/>
+              <w:t>(Anexo I, Pt. 4, n.º 1.1)</w:t>
+            </w:r>
+          </w:p>
+        </w:tc>
+        <w:tc>
+          <w:tcPr>
+            <w:tcW w:type="dxa" w:w="3118"/>
+            <w:vAlign w:val="top"/>
+            <w:tcMar>
+              <w:top w:w="50" w:type="dxa"/>
+              <w:start w:w="100" w:type="dxa"/>
+              <w:bottom w:w="50" w:type="dxa"/>
+              <w:end w:w="100" w:type="dxa"/>
+            </w:tcMar>
+          </w:tcPr>
+          <w:p>
+            <w:pPr>
+              <w:jc w:val="left"/>
+            </w:pPr>
+            <w:r>
+              <w:rPr>
+                <w:sz w:val="16"/>
+              </w:rPr>
+              <w:t>Não regulado especificamente</w:t>
+            </w:r>
+          </w:p>
+        </w:tc>
+        <w:tc>
+          <w:tcPr>
+            <w:tcW w:type="dxa" w:w="3118"/>
+            <w:vAlign w:val="top"/>
+            <w:tcMar>
+              <w:top w:w="50" w:type="dxa"/>
+              <w:start w:w="100" w:type="dxa"/>
+              <w:bottom w:w="50" w:type="dxa"/>
+              <w:end w:w="100" w:type="dxa"/>
+            </w:tcMar>
+          </w:tcPr>
+          <w:p>
+            <w:pPr>
+              <w:jc w:val="left"/>
+            </w:pPr>
+            <w:r>
+              <w:rPr>
+                <w:sz w:val="16"/>
+              </w:rPr>
+              <w:t>Não regulado especificamente</w:t>
             </w:r>
           </w:p>
         </w:tc>

</xml_diff>